<commit_message>
Doc Issue Überarbeitung in progress
</commit_message>
<xml_diff>
--- a/Doc_Issues/01_20_22_27_WindradKonzept_dtepic_nzopf_yalemu_aschajchiev.docx
+++ b/Doc_Issues/01_20_22_27_WindradKonzept_dtepic_nzopf_yalemu_aschajchiev.docx
@@ -5,10 +5,30 @@
     <w:p>
       <w:pPr>
         <w:pStyle w:val="Titel"/>
+        <w:rPr>
+          <w:lang w:val="de-DE"/>
+        </w:rPr>
       </w:pPr>
       <w:r>
-        <w:t>Windrad-System – Virtual Engineering Konzept (One-Pager)</w:t>
-      </w:r>
+        <w:rPr>
+          <w:lang w:val="de-DE"/>
+        </w:rPr>
+        <w:t>Windrad-System – Virtual Engineering Konzept</w:t>
+      </w:r>
+      <w:r>
+        <w:rPr>
+          <w:lang w:val="de-DE"/>
+        </w:rPr>
+        <w:t xml:space="preserve"> + Doc </w:t>
+      </w:r>
+      <w:proofErr w:type="spellStart"/>
+      <w:r>
+        <w:rPr>
+          <w:lang w:val="de-DE"/>
+        </w:rPr>
+        <w:t>Issue</w:t>
+      </w:r>
+      <w:proofErr w:type="spellEnd"/>
     </w:p>
     <w:p>
       <w:pPr>
@@ -103,7 +123,15 @@
         <w:pStyle w:val="berschrift1"/>
       </w:pPr>
       <w:r>
-        <w:t>2. Input → Verarbeitung → Output</w:t>
+        <w:t xml:space="preserve">2. Input → </w:t>
+      </w:r>
+      <w:proofErr w:type="spellStart"/>
+      <w:r>
+        <w:t>Verarbeitung</w:t>
+      </w:r>
+      <w:proofErr w:type="spellEnd"/>
+      <w:r>
+        <w:t xml:space="preserve"> → Output</w:t>
       </w:r>
     </w:p>
     <w:tbl>
@@ -133,9 +161,11 @@
             <w:tcW w:w="2880" w:type="dxa"/>
           </w:tcPr>
           <w:p>
+            <w:proofErr w:type="spellStart"/>
             <w:r>
               <w:t>Verarbeitung</w:t>
             </w:r>
+            <w:proofErr w:type="spellEnd"/>
           </w:p>
         </w:tc>
         <w:tc>
@@ -174,7 +204,21 @@
               <w:rPr>
                 <w:lang w:val="de-AT"/>
               </w:rPr>
-              <w:t>Wetterbericht aus London (zb. Unwetter)</w:t>
+              <w:t>Wetterbericht aus London (</w:t>
+            </w:r>
+            <w:proofErr w:type="spellStart"/>
+            <w:r>
+              <w:rPr>
+                <w:lang w:val="de-AT"/>
+              </w:rPr>
+              <w:t>zb</w:t>
+            </w:r>
+            <w:proofErr w:type="spellEnd"/>
+            <w:r>
+              <w:rPr>
+                <w:lang w:val="de-AT"/>
+              </w:rPr>
+              <w:t>. Unwetter)</w:t>
             </w:r>
           </w:p>
         </w:tc>
@@ -222,7 +266,21 @@
               <w:rPr>
                 <w:lang w:val="de-AT"/>
               </w:rPr>
-              <w:t>Wetterbericht aus L.A (z.B Sonnig, wenig Wind)</w:t>
+              <w:t>Wetterbericht aus L.A (</w:t>
+            </w:r>
+            <w:proofErr w:type="spellStart"/>
+            <w:r>
+              <w:rPr>
+                <w:lang w:val="de-AT"/>
+              </w:rPr>
+              <w:t>z.B</w:t>
+            </w:r>
+            <w:proofErr w:type="spellEnd"/>
+            <w:r>
+              <w:rPr>
+                <w:lang w:val="de-AT"/>
+              </w:rPr>
+              <w:t xml:space="preserve"> Sonnig, wenig Wind)</w:t>
             </w:r>
           </w:p>
         </w:tc>
@@ -364,6 +422,10 @@
     <w:p>
       <w:pPr>
         <w:pStyle w:val="berschrift1"/>
+        <w:tabs>
+          <w:tab w:val="left" w:pos="-709"/>
+        </w:tabs>
+        <w:ind w:left="-851"/>
         <w:rPr>
           <w:lang w:val="de-AT"/>
         </w:rPr>
@@ -466,7 +528,21 @@
           <w:lang w:val="de-AT"/>
         </w:rPr>
         <w:lastRenderedPageBreak/>
-        <w:t>5. Interaktion (TdoT)</w:t>
+        <w:t>5. Interaktion (</w:t>
+      </w:r>
+      <w:proofErr w:type="spellStart"/>
+      <w:r>
+        <w:rPr>
+          <w:lang w:val="de-AT"/>
+        </w:rPr>
+        <w:t>TdoT</w:t>
+      </w:r>
+      <w:proofErr w:type="spellEnd"/>
+      <w:r>
+        <w:rPr>
+          <w:lang w:val="de-AT"/>
+        </w:rPr>
+        <w:t>)</w:t>
       </w:r>
     </w:p>
     <w:p>
@@ -560,7 +636,7 @@
                     <pic:cNvPicPr/>
                   </pic:nvPicPr>
                   <pic:blipFill>
-                    <a:blip r:embed="rId9"/>
+                    <a:blip r:embed="rId11"/>
                     <a:stretch>
                       <a:fillRect/>
                     </a:stretch>
@@ -587,11 +663,15 @@
           <w:tab w:val="left" w:pos="1044"/>
         </w:tabs>
         <w:rPr>
+          <w:b/>
+          <w:bCs/>
           <w:lang w:val="de-AT"/>
         </w:rPr>
       </w:pPr>
       <w:r>
         <w:rPr>
+          <w:b/>
+          <w:bCs/>
           <w:noProof/>
           <w:lang w:val="de-AT"/>
         </w:rPr>
@@ -627,7 +707,7 @@
                     <pic:cNvPicPr/>
                   </pic:nvPicPr>
                   <pic:blipFill>
-                    <a:blip r:embed="rId10"/>
+                    <a:blip r:embed="rId12"/>
                     <a:stretch>
                       <a:fillRect/>
                     </a:stretch>
@@ -655,12 +735,16 @@
       </w:r>
       <w:r>
         <w:rPr>
+          <w:b/>
+          <w:bCs/>
           <w:lang w:val="de-AT"/>
         </w:rPr>
         <w:t xml:space="preserve">Windräder Modelle: </w:t>
       </w:r>
       <w:r>
         <w:rPr>
+          <w:b/>
+          <w:bCs/>
           <w:lang w:val="de-AT"/>
         </w:rPr>
         <w:t xml:space="preserve">                                                                         Gelände:</w:t>
@@ -683,6 +767,7 @@
           <w:tab w:val="left" w:pos="1044"/>
         </w:tabs>
         <w:rPr>
+          <w:noProof/>
           <w:lang w:val="de-DE"/>
         </w:rPr>
       </w:pPr>
@@ -709,7 +794,7 @@
                     </pic:cNvPicPr>
                   </pic:nvPicPr>
                   <pic:blipFill rotWithShape="1">
-                    <a:blip r:embed="rId11">
+                    <a:blip r:embed="rId13">
                       <a:extLst>
                         <a:ext uri="{28A0092B-C50C-407E-A947-70E740481C1C}">
                           <a14:useLocalDpi xmlns:a14="http://schemas.microsoft.com/office/drawing/2010/main" val="0"/>
@@ -746,14 +831,721 @@
         </w:drawing>
       </w:r>
     </w:p>
+    <w:p>
+      <w:pPr>
+        <w:rPr>
+          <w:lang w:val="de-DE"/>
+        </w:rPr>
+      </w:pPr>
+    </w:p>
+    <w:p>
+      <w:pPr>
+        <w:pStyle w:val="berschrift1"/>
+        <w:rPr>
+          <w:lang w:val="de-DE"/>
+        </w:rPr>
+      </w:pPr>
+    </w:p>
+    <w:p>
+      <w:pPr>
+        <w:pStyle w:val="berschrift1"/>
+      </w:pPr>
+      <w:r>
+        <w:t xml:space="preserve">7. </w:t>
+      </w:r>
+      <w:proofErr w:type="spellStart"/>
+      <w:r>
+        <w:t>Doc_issue</w:t>
+      </w:r>
+      <w:proofErr w:type="spellEnd"/>
+      <w:r>
+        <w:t xml:space="preserve"> </w:t>
+      </w:r>
+    </w:p>
+    <w:p/>
+    <w:p>
+      <w:pPr>
+        <w:pStyle w:val="berschrift3"/>
+      </w:pPr>
+      <w:r>
+        <w:t xml:space="preserve">#1 </w:t>
+      </w:r>
+      <w:proofErr w:type="spellStart"/>
+      <w:r>
+        <w:t>Doc_Issue</w:t>
+      </w:r>
+      <w:proofErr w:type="spellEnd"/>
+      <w:r>
+        <w:t xml:space="preserve"> </w:t>
+      </w:r>
+      <w:r>
+        <w:rPr>
+          <w:lang w:val="de-DE"/>
+        </w:rPr>
+        <w:sym w:font="Wingdings" w:char="F0E0"/>
+      </w:r>
+      <w:r>
+        <w:t xml:space="preserve"> Alichan Schajchiev</w:t>
+      </w:r>
+    </w:p>
+    <w:p>
+      <w:pPr>
+        <w:ind w:left="1440"/>
+        <w:rPr>
+          <w:lang w:val="de-DE"/>
+        </w:rPr>
+      </w:pPr>
+      <w:r>
+        <w:rPr>
+          <w:lang w:val="de-DE"/>
+        </w:rPr>
+        <w:t>Alle Skizzen Beschreibung, Skizzen für Windräder, Skizzen für die Umgebung etc.</w:t>
+      </w:r>
+    </w:p>
+    <w:p>
+      <w:pPr>
+        <w:ind w:left="720"/>
+        <w:rPr>
+          <w:lang w:val="de-DE"/>
+        </w:rPr>
+      </w:pPr>
+    </w:p>
+    <w:p>
+      <w:pPr>
+        <w:pStyle w:val="berschrift3"/>
+        <w:rPr>
+          <w:szCs w:val="32"/>
+        </w:rPr>
+      </w:pPr>
+      <w:r>
+        <w:rPr>
+          <w:szCs w:val="32"/>
+        </w:rPr>
+        <w:t xml:space="preserve">#2 </w:t>
+      </w:r>
+      <w:r>
+        <w:rPr>
+          <w:szCs w:val="32"/>
+        </w:rPr>
+        <w:t xml:space="preserve">Create base unity Project </w:t>
+      </w:r>
+      <w:r>
+        <w:rPr>
+          <w:szCs w:val="32"/>
+          <w:lang w:val="de-DE"/>
+        </w:rPr>
+        <w:sym w:font="Wingdings" w:char="F0E0"/>
+      </w:r>
+      <w:r>
+        <w:rPr>
+          <w:szCs w:val="32"/>
+        </w:rPr>
+        <w:t xml:space="preserve"> </w:t>
+      </w:r>
+      <w:r>
+        <w:rPr>
+          <w:szCs w:val="32"/>
+        </w:rPr>
+        <w:t>Noah Zopf</w:t>
+      </w:r>
+    </w:p>
+    <w:p>
+      <w:pPr>
+        <w:ind w:left="1440"/>
+        <w:rPr>
+          <w:lang w:val="de-DE"/>
+        </w:rPr>
+      </w:pPr>
+      <w:r>
+        <w:rPr>
+          <w:lang w:val="de-DE"/>
+        </w:rPr>
+        <w:t>Zweck: Grund-Unity-Projekt für das Projekt zur Verfügung stellen</w:t>
+      </w:r>
+      <w:r>
+        <w:rPr>
+          <w:lang w:val="de-DE"/>
+        </w:rPr>
+        <w:br/>
+        <w:t>Kurzbeschreibung: Erstellung eines neuen Unity Projekts und hinzufügen ins Repo</w:t>
+      </w:r>
+      <w:r>
+        <w:rPr>
+          <w:lang w:val="de-DE"/>
+        </w:rPr>
+        <w:br/>
+        <w:t>Akzeptanzkriterium: Projekt kann in Unity geöffnet werden und bearbeitet werden</w:t>
+      </w:r>
+    </w:p>
+    <w:p>
+      <w:pPr>
+        <w:pStyle w:val="berschrift3"/>
+        <w:rPr>
+          <w:lang w:val="de-DE"/>
+        </w:rPr>
+      </w:pPr>
+      <w:r>
+        <w:rPr>
+          <w:lang w:val="de-DE"/>
+        </w:rPr>
+        <w:t xml:space="preserve">#3 Recherche Windräder </w:t>
+      </w:r>
+      <w:r>
+        <w:rPr>
+          <w:lang w:val="de-DE"/>
+        </w:rPr>
+        <w:sym w:font="Wingdings" w:char="F0E0"/>
+      </w:r>
+      <w:r>
+        <w:rPr>
+          <w:lang w:val="de-DE"/>
+        </w:rPr>
+        <w:t xml:space="preserve"> Yohannes Alemu</w:t>
+      </w:r>
+    </w:p>
+    <w:p>
+      <w:pPr>
+        <w:rPr>
+          <w:lang w:val="de-DE"/>
+        </w:rPr>
+      </w:pPr>
+      <w:r>
+        <w:rPr>
+          <w:lang w:val="de-DE"/>
+        </w:rPr>
+        <w:tab/>
+      </w:r>
+      <w:r>
+        <w:rPr>
+          <w:lang w:val="de-DE"/>
+        </w:rPr>
+        <w:tab/>
+      </w:r>
+      <w:r>
+        <w:rPr>
+          <w:lang w:val="de-DE"/>
+        </w:rPr>
+        <w:t>Windräder</w:t>
+      </w:r>
+      <w:r>
+        <w:rPr>
+          <w:lang w:val="de-DE"/>
+        </w:rPr>
+        <w:t xml:space="preserve"> Modelle im Internet suchen</w:t>
+      </w:r>
+    </w:p>
+    <w:p>
+      <w:pPr>
+        <w:pStyle w:val="berschrift3"/>
+      </w:pPr>
+      <w:r>
+        <w:t>#4 Create landscape for later us</w:t>
+      </w:r>
+      <w:r>
+        <w:t xml:space="preserve">e </w:t>
+      </w:r>
+      <w:r>
+        <w:sym w:font="Wingdings" w:char="F0E0"/>
+      </w:r>
+      <w:r>
+        <w:t xml:space="preserve"> Darko Tepic</w:t>
+      </w:r>
+    </w:p>
+    <w:p>
+      <w:pPr>
+        <w:ind w:left="1440"/>
+        <w:rPr>
+          <w:lang w:val="de-DE"/>
+        </w:rPr>
+      </w:pPr>
+      <w:r>
+        <w:rPr>
+          <w:lang w:val="de-DE"/>
+        </w:rPr>
+        <w:t>Idee: Eine Graslandschaft für das Unity Projekt erstellen</w:t>
+      </w:r>
+      <w:r>
+        <w:rPr>
+          <w:lang w:val="de-DE"/>
+        </w:rPr>
+        <w:br/>
+        <w:t>Akzeptanzkriterien: Es ist erkennbar das es eine Graslandschaft ist. Das Modell lässt sich ins Unity Projekt einfügen und benutzen.</w:t>
+      </w:r>
+    </w:p>
+    <w:p>
+      <w:pPr>
+        <w:pStyle w:val="berschrift3"/>
+      </w:pPr>
+      <w:r>
+        <w:t xml:space="preserve">#5 Search for windmill-model </w:t>
+      </w:r>
+      <w:r>
+        <w:sym w:font="Wingdings" w:char="F0E0"/>
+      </w:r>
+      <w:r>
+        <w:t xml:space="preserve"> Alichan Schajchiev</w:t>
+      </w:r>
+    </w:p>
+    <w:p>
+      <w:pPr>
+        <w:ind w:left="1440"/>
+        <w:rPr>
+          <w:lang w:val="de-DE"/>
+        </w:rPr>
+      </w:pPr>
+      <w:r>
+        <w:rPr>
+          <w:lang w:val="de-DE"/>
+        </w:rPr>
+        <w:t>Idee: Windrad 3D-Modell finden</w:t>
+      </w:r>
+      <w:r>
+        <w:rPr>
+          <w:lang w:val="de-DE"/>
+        </w:rPr>
+        <w:t xml:space="preserve"> </w:t>
+      </w:r>
+      <w:r>
+        <w:rPr>
+          <w:lang w:val="de-DE"/>
+        </w:rPr>
+        <w:br/>
+      </w:r>
+      <w:r>
+        <w:rPr>
+          <w:lang w:val="de-DE"/>
+        </w:rPr>
+        <w:t xml:space="preserve">Akzeptanz </w:t>
+      </w:r>
+      <w:proofErr w:type="spellStart"/>
+      <w:r>
+        <w:rPr>
+          <w:lang w:val="de-DE"/>
+        </w:rPr>
+        <w:t>kriterien</w:t>
+      </w:r>
+      <w:proofErr w:type="spellEnd"/>
+      <w:r>
+        <w:rPr>
+          <w:lang w:val="de-DE"/>
+        </w:rPr>
+        <w:t xml:space="preserve">: Ein </w:t>
+      </w:r>
+      <w:proofErr w:type="gramStart"/>
+      <w:r>
+        <w:rPr>
+          <w:lang w:val="de-DE"/>
+        </w:rPr>
+        <w:t>Modell</w:t>
+      </w:r>
+      <w:proofErr w:type="gramEnd"/>
+      <w:r>
+        <w:rPr>
+          <w:lang w:val="de-DE"/>
+        </w:rPr>
+        <w:t xml:space="preserve"> dass man in Unity öffnen </w:t>
+      </w:r>
+      <w:proofErr w:type="gramStart"/>
+      <w:r>
+        <w:rPr>
+          <w:lang w:val="de-DE"/>
+        </w:rPr>
+        <w:t>kann</w:t>
+      </w:r>
+      <w:proofErr w:type="gramEnd"/>
+      <w:r>
+        <w:rPr>
+          <w:lang w:val="de-DE"/>
+        </w:rPr>
+        <w:br/>
+        <w:t>Ein Modell das wie ein Windrad aussieht</w:t>
+      </w:r>
+    </w:p>
+    <w:p>
+      <w:pPr>
+        <w:pStyle w:val="berschrift3"/>
+      </w:pPr>
+      <w:r>
+        <w:t>#6 Find Prototype 3d Model</w:t>
+      </w:r>
+      <w:r>
+        <w:t xml:space="preserve"> </w:t>
+      </w:r>
+      <w:r>
+        <w:rPr>
+          <w:lang w:val="de-DE"/>
+        </w:rPr>
+        <w:sym w:font="Wingdings" w:char="F0E0"/>
+      </w:r>
+      <w:r>
+        <w:t xml:space="preserve"> Darko Tep</w:t>
+      </w:r>
+      <w:r>
+        <w:t>ic</w:t>
+      </w:r>
+    </w:p>
+    <w:p>
+      <w:pPr>
+        <w:ind w:left="1440"/>
+        <w:rPr>
+          <w:lang w:val="de-DE"/>
+        </w:rPr>
+      </w:pPr>
+      <w:r>
+        <w:rPr>
+          <w:lang w:val="de-DE"/>
+        </w:rPr>
+        <w:t>Idee: Windrad 3D-Modell finden</w:t>
+      </w:r>
+      <w:r>
+        <w:rPr>
+          <w:lang w:val="de-DE"/>
+        </w:rPr>
+        <w:br/>
+        <w:t xml:space="preserve">Akzeptanz </w:t>
+      </w:r>
+      <w:proofErr w:type="spellStart"/>
+      <w:r>
+        <w:rPr>
+          <w:lang w:val="de-DE"/>
+        </w:rPr>
+        <w:t>kriterien</w:t>
+      </w:r>
+      <w:proofErr w:type="spellEnd"/>
+      <w:r>
+        <w:rPr>
+          <w:lang w:val="de-DE"/>
+        </w:rPr>
+        <w:t xml:space="preserve">: Ein </w:t>
+      </w:r>
+      <w:proofErr w:type="gramStart"/>
+      <w:r>
+        <w:rPr>
+          <w:lang w:val="de-DE"/>
+        </w:rPr>
+        <w:t>Modell</w:t>
+      </w:r>
+      <w:proofErr w:type="gramEnd"/>
+      <w:r>
+        <w:rPr>
+          <w:lang w:val="de-DE"/>
+        </w:rPr>
+        <w:t xml:space="preserve"> dass man in Unity öffnen </w:t>
+      </w:r>
+      <w:proofErr w:type="gramStart"/>
+      <w:r>
+        <w:rPr>
+          <w:lang w:val="de-DE"/>
+        </w:rPr>
+        <w:t>kann</w:t>
+      </w:r>
+      <w:proofErr w:type="gramEnd"/>
+      <w:r>
+        <w:rPr>
+          <w:lang w:val="de-DE"/>
+        </w:rPr>
+        <w:br/>
+        <w:t>Ein Modell das wie ein Windrad aussieht</w:t>
+      </w:r>
+    </w:p>
+    <w:p>
+      <w:pPr>
+        <w:ind w:left="1440"/>
+        <w:rPr>
+          <w:lang w:val="de-DE"/>
+        </w:rPr>
+      </w:pPr>
+    </w:p>
+    <w:p>
+      <w:pPr>
+        <w:pStyle w:val="berschrift3"/>
+      </w:pPr>
+      <w:r>
+        <w:lastRenderedPageBreak/>
+        <w:t>#7 Insert researched windmill-model into Unity Project</w:t>
+      </w:r>
+      <w:r>
+        <w:t xml:space="preserve"> </w:t>
+      </w:r>
+      <w:r>
+        <w:sym w:font="Wingdings" w:char="F0E0"/>
+      </w:r>
+      <w:r>
+        <w:t>Noah Zopf</w:t>
+      </w:r>
+    </w:p>
+    <w:p>
+      <w:pPr>
+        <w:ind w:left="1440"/>
+        <w:rPr>
+          <w:lang w:val="de-DE"/>
+        </w:rPr>
+      </w:pPr>
+      <w:r>
+        <w:rPr>
+          <w:lang w:val="de-DE"/>
+        </w:rPr>
+        <w:t xml:space="preserve">Zweck: </w:t>
+      </w:r>
+      <w:proofErr w:type="spellStart"/>
+      <w:r>
+        <w:rPr>
+          <w:lang w:val="de-DE"/>
+        </w:rPr>
+        <w:t>Gefundes</w:t>
+      </w:r>
+      <w:proofErr w:type="spellEnd"/>
+      <w:r>
+        <w:rPr>
+          <w:lang w:val="de-DE"/>
+        </w:rPr>
+        <w:t xml:space="preserve"> </w:t>
+      </w:r>
+      <w:proofErr w:type="spellStart"/>
+      <w:r>
+        <w:rPr>
+          <w:lang w:val="de-DE"/>
+        </w:rPr>
+        <w:t>windrad</w:t>
+      </w:r>
+      <w:proofErr w:type="spellEnd"/>
+      <w:r>
+        <w:rPr>
+          <w:lang w:val="de-DE"/>
+        </w:rPr>
+        <w:t xml:space="preserve"> </w:t>
+      </w:r>
+      <w:proofErr w:type="spellStart"/>
+      <w:r>
+        <w:rPr>
+          <w:lang w:val="de-DE"/>
+        </w:rPr>
+        <w:t>modell</w:t>
+      </w:r>
+      <w:proofErr w:type="spellEnd"/>
+      <w:r>
+        <w:rPr>
+          <w:lang w:val="de-DE"/>
+        </w:rPr>
+        <w:t xml:space="preserve"> muss in das Unity Projekt importiert werden.</w:t>
+      </w:r>
+      <w:r>
+        <w:rPr>
+          <w:lang w:val="de-DE"/>
+        </w:rPr>
+        <w:br/>
+        <w:t xml:space="preserve">Kurzbeschreibung: Gefundenes 3D </w:t>
+      </w:r>
+      <w:proofErr w:type="spellStart"/>
+      <w:r>
+        <w:rPr>
+          <w:lang w:val="de-DE"/>
+        </w:rPr>
+        <w:t>modell</w:t>
+      </w:r>
+      <w:proofErr w:type="spellEnd"/>
+      <w:r>
+        <w:rPr>
+          <w:lang w:val="de-DE"/>
+        </w:rPr>
+        <w:t xml:space="preserve"> wird in das Unity Projekt importiert</w:t>
+      </w:r>
+      <w:r>
+        <w:rPr>
+          <w:lang w:val="de-DE"/>
+        </w:rPr>
+        <w:br/>
+        <w:t xml:space="preserve">Akzeptanzkriterium: Windrad ist im Unity Projekt zu sehen und kann als </w:t>
+      </w:r>
+      <w:proofErr w:type="spellStart"/>
+      <w:r>
+        <w:rPr>
+          <w:lang w:val="de-DE"/>
+        </w:rPr>
+        <w:t>GameObject</w:t>
+      </w:r>
+      <w:proofErr w:type="spellEnd"/>
+      <w:r>
+        <w:rPr>
+          <w:lang w:val="de-DE"/>
+        </w:rPr>
+        <w:t xml:space="preserve"> angesteuert werden</w:t>
+      </w:r>
+    </w:p>
+    <w:p>
+      <w:pPr>
+        <w:pStyle w:val="berschrift3"/>
+        <w:rPr>
+          <w:lang w:val="de-DE"/>
+        </w:rPr>
+      </w:pPr>
+      <w:r>
+        <w:rPr>
+          <w:lang w:val="de-DE"/>
+        </w:rPr>
+        <w:t>#8 Readme Erstellung</w:t>
+      </w:r>
+    </w:p>
+    <w:p>
+      <w:pPr>
+        <w:ind w:left="1440"/>
+        <w:rPr>
+          <w:lang w:val="de-DE"/>
+        </w:rPr>
+      </w:pPr>
+      <w:r>
+        <w:rPr>
+          <w:lang w:val="de-DE"/>
+        </w:rPr>
+        <w:t>Zweck: Außenstehende über das Projekt informieren</w:t>
+      </w:r>
+      <w:r>
+        <w:rPr>
+          <w:lang w:val="de-DE"/>
+        </w:rPr>
+        <w:br/>
+        <w:t xml:space="preserve">Kurzbeschreibung: Das README enthält alle wichtigen </w:t>
+      </w:r>
+      <w:proofErr w:type="spellStart"/>
+      <w:r>
+        <w:rPr>
+          <w:lang w:val="de-DE"/>
+        </w:rPr>
+        <w:t>details</w:t>
+      </w:r>
+      <w:proofErr w:type="spellEnd"/>
+      <w:r>
+        <w:rPr>
+          <w:lang w:val="de-DE"/>
+        </w:rPr>
+        <w:t xml:space="preserve"> über das Projekt</w:t>
+      </w:r>
+      <w:r>
+        <w:rPr>
+          <w:lang w:val="de-DE"/>
+        </w:rPr>
+        <w:br/>
+        <w:t>Akzeptanzkriterium: Außenstehender kann durch kurzes lesen der Beschreibung alle wichtigen Details erkenne</w:t>
+      </w:r>
+    </w:p>
+    <w:p>
+      <w:pPr>
+        <w:pStyle w:val="berschrift3"/>
+        <w:rPr>
+          <w:lang w:val="de-DE"/>
+        </w:rPr>
+      </w:pPr>
+    </w:p>
+    <w:p>
+      <w:pPr>
+        <w:ind w:left="1440"/>
+        <w:rPr>
+          <w:lang w:val="de-DE"/>
+        </w:rPr>
+      </w:pPr>
+    </w:p>
+    <w:p>
+      <w:pPr>
+        <w:pStyle w:val="berschrift3"/>
+        <w:rPr>
+          <w:lang w:val="de-DE"/>
+        </w:rPr>
+      </w:pPr>
+    </w:p>
+    <w:p>
+      <w:pPr>
+        <w:rPr>
+          <w:lang w:val="de-DE"/>
+        </w:rPr>
+      </w:pPr>
+    </w:p>
+    <w:p>
+      <w:pPr>
+        <w:rPr>
+          <w:lang w:val="de-DE"/>
+        </w:rPr>
+      </w:pPr>
+    </w:p>
+    <w:p>
+      <w:pPr>
+        <w:ind w:left="720"/>
+        <w:rPr>
+          <w:lang w:val="de-DE"/>
+        </w:rPr>
+      </w:pPr>
+    </w:p>
+    <w:p>
+      <w:pPr>
+        <w:rPr>
+          <w:lang w:val="de-DE"/>
+        </w:rPr>
+      </w:pPr>
+    </w:p>
+    <w:p>
+      <w:pPr>
+        <w:rPr>
+          <w:lang w:val="de-DE"/>
+        </w:rPr>
+      </w:pPr>
+    </w:p>
     <w:sectPr>
       <w:pgSz w:w="12240" w:h="15840"/>
-      <w:pgMar w:top="1440" w:right="1800" w:bottom="1440" w:left="1800" w:header="720" w:footer="720" w:gutter="0"/>
+      <w:pgMar w:top="1440" w:right="1800" w:bottom="1440" w:left="993" w:header="720" w:footer="720" w:gutter="0"/>
       <w:cols w:space="720"/>
       <w:docGrid w:linePitch="360"/>
     </w:sectPr>
   </w:body>
 </w:document>
+</file>
+
+<file path=word/endnotes.xml><?xml version="1.0" encoding="utf-8"?>
+<w:endnotes xmlns:wpc="http://schemas.microsoft.com/office/word/2010/wordprocessingCanvas" xmlns:cx="http://schemas.microsoft.com/office/drawing/2014/chartex" xmlns:cx1="http://schemas.microsoft.com/office/drawing/2015/9/8/chartex" xmlns:cx2="http://schemas.microsoft.com/office/drawing/2015/10/21/chartex" xmlns:cx3="http://schemas.microsoft.com/office/drawing/2016/5/9/chartex" xmlns:cx4="http://schemas.microsoft.com/office/drawing/2016/5/10/chartex" xmlns:cx5="http://schemas.microsoft.com/office/drawing/2016/5/11/chartex" xmlns:cx6="http://schemas.microsoft.com/office/drawing/2016/5/12/chartex" xmlns:cx7="http://schemas.microsoft.com/office/drawing/2016/5/13/chartex" xmlns:cx8="http://schemas.microsoft.com/office/drawing/2016/5/14/chartex" xmlns:mc="http://schemas.openxmlformats.org/markup-compatibility/2006" xmlns:aink="http://schemas.microsoft.com/office/drawing/2016/ink" xmlns:am3d="http://schemas.microsoft.com/office/drawing/2017/model3d" xmlns:o="urn:schemas-microsoft-com:office:office" xmlns:oel="http://schemas.microsoft.com/office/2019/extlst" xmlns:r="http://schemas.openxmlformats.org/officeDocument/2006/relationships" xmlns:m="http://schemas.openxmlformats.org/officeDocument/2006/math" xmlns:v="urn:schemas-microsoft-com:vml" xmlns:wp14="http://schemas.microsoft.com/office/word/2010/wordprocessingDrawing" xmlns:wp="http://schemas.openxmlformats.org/drawingml/2006/wordprocessingDrawing" xmlns:w10="urn:schemas-microsoft-com:office:word" xmlns:w="http://schemas.openxmlformats.org/wordprocessingml/2006/main" xmlns:w14="http://schemas.microsoft.com/office/word/2010/wordml" xmlns:w15="http://schemas.microsoft.com/office/word/2012/wordml" xmlns:w16cex="http://schemas.microsoft.com/office/word/2018/wordml/cex" xmlns:w16cid="http://schemas.microsoft.com/office/word/2016/wordml/cid" xmlns:w16="http://schemas.microsoft.com/office/word/2018/wordml" xmlns:w16du="http://schemas.microsoft.com/office/word/2023/wordml/word16du" xmlns:w16sdtdh="http://schemas.microsoft.com/office/word/2020/wordml/sdtdatahash" xmlns:w16sdtfl="http://schemas.microsoft.com/office/word/2024/wordml/sdtformatlock" xmlns:w16se="http://schemas.microsoft.com/office/word/2015/wordml/symex" xmlns:wpg="http://schemas.microsoft.com/office/word/2010/wordprocessingGroup" xmlns:wpi="http://schemas.microsoft.com/office/word/2010/wordprocessingInk" xmlns:wne="http://schemas.microsoft.com/office/word/2006/wordml" xmlns:wps="http://schemas.microsoft.com/office/word/2010/wordprocessingShape" mc:Ignorable="w14 w15 w16se w16cid w16 w16cex w16sdtdh w16sdtfl w16du wp14">
+  <w:endnote w:type="separator" w:id="-1">
+    <w:p>
+      <w:pPr>
+        <w:spacing w:after="0" w:line="240" w:lineRule="auto"/>
+      </w:pPr>
+      <w:r>
+        <w:separator/>
+      </w:r>
+    </w:p>
+  </w:endnote>
+  <w:endnote w:type="continuationSeparator" w:id="0">
+    <w:p>
+      <w:pPr>
+        <w:spacing w:after="0" w:line="240" w:lineRule="auto"/>
+      </w:pPr>
+      <w:r>
+        <w:continuationSeparator/>
+      </w:r>
+    </w:p>
+  </w:endnote>
+</w:endnotes>
+</file>
+
+<file path=word/footnotes.xml><?xml version="1.0" encoding="utf-8"?>
+<w:footnotes xmlns:wpc="http://schemas.microsoft.com/office/word/2010/wordprocessingCanvas" xmlns:cx="http://schemas.microsoft.com/office/drawing/2014/chartex" xmlns:cx1="http://schemas.microsoft.com/office/drawing/2015/9/8/chartex" xmlns:cx2="http://schemas.microsoft.com/office/drawing/2015/10/21/chartex" xmlns:cx3="http://schemas.microsoft.com/office/drawing/2016/5/9/chartex" xmlns:cx4="http://schemas.microsoft.com/office/drawing/2016/5/10/chartex" xmlns:cx5="http://schemas.microsoft.com/office/drawing/2016/5/11/chartex" xmlns:cx6="http://schemas.microsoft.com/office/drawing/2016/5/12/chartex" xmlns:cx7="http://schemas.microsoft.com/office/drawing/2016/5/13/chartex" xmlns:cx8="http://schemas.microsoft.com/office/drawing/2016/5/14/chartex" xmlns:mc="http://schemas.openxmlformats.org/markup-compatibility/2006" xmlns:aink="http://schemas.microsoft.com/office/drawing/2016/ink" xmlns:am3d="http://schemas.microsoft.com/office/drawing/2017/model3d" xmlns:o="urn:schemas-microsoft-com:office:office" xmlns:oel="http://schemas.microsoft.com/office/2019/extlst" xmlns:r="http://schemas.openxmlformats.org/officeDocument/2006/relationships" xmlns:m="http://schemas.openxmlformats.org/officeDocument/2006/math" xmlns:v="urn:schemas-microsoft-com:vml" xmlns:wp14="http://schemas.microsoft.com/office/word/2010/wordprocessingDrawing" xmlns:wp="http://schemas.openxmlformats.org/drawingml/2006/wordprocessingDrawing" xmlns:w10="urn:schemas-microsoft-com:office:word" xmlns:w="http://schemas.openxmlformats.org/wordprocessingml/2006/main" xmlns:w14="http://schemas.microsoft.com/office/word/2010/wordml" xmlns:w15="http://schemas.microsoft.com/office/word/2012/wordml" xmlns:w16cex="http://schemas.microsoft.com/office/word/2018/wordml/cex" xmlns:w16cid="http://schemas.microsoft.com/office/word/2016/wordml/cid" xmlns:w16="http://schemas.microsoft.com/office/word/2018/wordml" xmlns:w16du="http://schemas.microsoft.com/office/word/2023/wordml/word16du" xmlns:w16sdtdh="http://schemas.microsoft.com/office/word/2020/wordml/sdtdatahash" xmlns:w16sdtfl="http://schemas.microsoft.com/office/word/2024/wordml/sdtformatlock" xmlns:w16se="http://schemas.microsoft.com/office/word/2015/wordml/symex" xmlns:wpg="http://schemas.microsoft.com/office/word/2010/wordprocessingGroup" xmlns:wpi="http://schemas.microsoft.com/office/word/2010/wordprocessingInk" xmlns:wne="http://schemas.microsoft.com/office/word/2006/wordml" xmlns:wps="http://schemas.microsoft.com/office/word/2010/wordprocessingShape" mc:Ignorable="w14 w15 w16se w16cid w16 w16cex w16sdtdh w16sdtfl w16du wp14">
+  <w:footnote w:type="separator" w:id="-1">
+    <w:p>
+      <w:pPr>
+        <w:spacing w:after="0" w:line="240" w:lineRule="auto"/>
+      </w:pPr>
+      <w:r>
+        <w:separator/>
+      </w:r>
+    </w:p>
+  </w:footnote>
+  <w:footnote w:type="continuationSeparator" w:id="0">
+    <w:p>
+      <w:pPr>
+        <w:spacing w:after="0" w:line="240" w:lineRule="auto"/>
+      </w:pPr>
+      <w:r>
+        <w:continuationSeparator/>
+      </w:r>
+    </w:p>
+  </w:footnote>
+</w:footnotes>
 </file>
 
 <file path=word/numbering.xml><?xml version="1.0" encoding="utf-8"?>
@@ -1357,11 +2149,12 @@
     <w:link w:val="berschrift1Zchn"/>
     <w:uiPriority w:val="9"/>
     <w:qFormat/>
-    <w:rsid w:val="00FC693F"/>
+    <w:rsid w:val="006647A4"/>
     <w:pPr>
       <w:keepNext/>
       <w:keepLines/>
       <w:spacing w:before="480" w:after="0"/>
+      <w:jc w:val="center"/>
       <w:outlineLvl w:val="0"/>
     </w:pPr>
     <w:rPr>
@@ -1369,7 +2162,7 @@
       <w:b/>
       <w:bCs/>
       <w:color w:val="365F91" w:themeColor="accent1" w:themeShade="BF"/>
-      <w:sz w:val="28"/>
+      <w:sz w:val="36"/>
       <w:szCs w:val="28"/>
     </w:rPr>
   </w:style>
@@ -1405,11 +2198,12 @@
     <w:uiPriority w:val="9"/>
     <w:unhideWhenUsed/>
     <w:qFormat/>
-    <w:rsid w:val="00FC693F"/>
+    <w:rsid w:val="00822197"/>
     <w:pPr>
       <w:keepNext/>
       <w:keepLines/>
       <w:spacing w:before="200" w:after="0"/>
+      <w:ind w:left="720"/>
       <w:outlineLvl w:val="2"/>
     </w:pPr>
     <w:rPr>
@@ -1417,6 +2211,7 @@
       <w:b/>
       <w:bCs/>
       <w:color w:val="4F81BD" w:themeColor="accent1"/>
+      <w:sz w:val="32"/>
     </w:rPr>
   </w:style>
   <w:style w:type="paragraph" w:styleId="berschrift4">
@@ -1562,6 +2357,7 @@
   <w:style w:type="character" w:default="1" w:styleId="Absatz-Standardschriftart">
     <w:name w:val="Default Paragraph Font"/>
     <w:uiPriority w:val="1"/>
+    <w:semiHidden/>
     <w:unhideWhenUsed/>
   </w:style>
   <w:style w:type="table" w:default="1" w:styleId="NormaleTabelle">
@@ -1643,13 +2439,13 @@
     <w:basedOn w:val="Absatz-Standardschriftart"/>
     <w:link w:val="berschrift1"/>
     <w:uiPriority w:val="9"/>
-    <w:rsid w:val="00FC693F"/>
+    <w:rsid w:val="006647A4"/>
     <w:rPr>
       <w:rFonts w:asciiTheme="majorHAnsi" w:eastAsiaTheme="majorEastAsia" w:hAnsiTheme="majorHAnsi" w:cstheme="majorBidi"/>
       <w:b/>
       <w:bCs/>
       <w:color w:val="365F91" w:themeColor="accent1" w:themeShade="BF"/>
-      <w:sz w:val="28"/>
+      <w:sz w:val="36"/>
       <w:szCs w:val="28"/>
     </w:rPr>
   </w:style>
@@ -1673,12 +2469,13 @@
     <w:basedOn w:val="Absatz-Standardschriftart"/>
     <w:link w:val="berschrift3"/>
     <w:uiPriority w:val="9"/>
-    <w:rsid w:val="00FC693F"/>
+    <w:rsid w:val="00822197"/>
     <w:rPr>
       <w:rFonts w:asciiTheme="majorHAnsi" w:eastAsiaTheme="majorEastAsia" w:hAnsiTheme="majorHAnsi" w:cstheme="majorBidi"/>
       <w:b/>
       <w:bCs/>
       <w:color w:val="4F81BD" w:themeColor="accent1"/>
+      <w:sz w:val="32"/>
     </w:rPr>
   </w:style>
   <w:style w:type="paragraph" w:styleId="Titel">

</xml_diff>